<commit_message>
fix(word-template): remove field-update prompt and fix OOXML schema order
- Remove w:updateFields so Word no longer asks to update fields on open.
- Set the cached PAGE / NUMPAGES results to 1 instead of the sample's 2 / 3.
- Put w:pBdr and w:shd in ECMA-376 schema order inside w:pPr, and write
  pBdr children as top, left, bottom, right, between.
- Put tblBorders before tblCellMar in the AD table style; give every w:shd
  w:val="clear".
- Add w:percent to w:zoom and move w:embedTrueTypeFonts to its schema position.

Both templates now pass XSD validation.
</commit_message>
<xml_diff>
--- a/templates/Accelerate-Data-Document-Template.docx
+++ b/templates/Accelerate-Data-Document-Template.docx
@@ -60,14 +60,14 @@
     <w:p>
       <w:pPr>
         <w:pStyle w:val="Subtitle"/>
+        <w:pBdr>
+          <w:top w:val="nil"/>
+          <w:left w:val="nil"/>
+          <w:bottom w:val="single" w:sz="12" w:space="16" w:color="00B4D8"/>
+          <w:right w:val="nil"/>
+          <w:between w:val="nil"/>
+        </w:pBdr>
         <w:spacing w:after="600"/>
-        <w:pBdr>
-          <w:top w:val="nil"/>
-          <w:left w:val="nil"/>
-          <w:right w:val="nil"/>
-          <w:between w:val="nil"/>
-          <w:bottom w:val="single" w:sz="12" w:space="16" w:color="00B4D8"/>
-        </w:pBdr>
       </w:pPr>
       <w:r>
         <w:t>[A short subtitle that states the purpose and intended outcome.]</w:t>
@@ -152,10 +152,10 @@
         <w:pStyle w:val="ADcallout"/>
         <w:pBdr>
           <w:top w:val="nil"/>
+          <w:left w:val="single" w:sz="16" w:space="10" w:color="00B4D8"/>
           <w:bottom w:val="nil"/>
           <w:right w:val="nil"/>
           <w:between w:val="nil"/>
-          <w:left w:val="single" w:sz="16" w:space="10" w:color="00B4D8"/>
         </w:pBdr>
       </w:pPr>
       <w:r>
@@ -531,16 +531,16 @@
   <w:p>
     <w:pPr>
       <w:pStyle w:val="Footer"/>
-      <w:tabs>
-        <w:tab w:pos="9298" w:val="right"/>
-      </w:tabs>
       <w:pBdr>
+        <w:top w:val="single" w:sz="4" w:space="8" w:color="D8DEE5"/>
         <w:left w:val="nil"/>
         <w:bottom w:val="nil"/>
         <w:right w:val="nil"/>
         <w:between w:val="nil"/>
-        <w:top w:val="single" w:sz="4" w:space="8" w:color="D8DEE5"/>
       </w:pBdr>
+      <w:tabs>
+        <w:tab w:pos="9298" w:val="right"/>
+      </w:tabs>
     </w:pPr>
     <w:r>
       <w:t>Accelerate Data  ·  [Classification]</w:t>
@@ -554,7 +554,7 @@
       <w:fldChar w:fldCharType="separate"/>
     </w:r>
     <w:r>
-      <w:t>2</w:t>
+      <w:t>1</w:t>
     </w:r>
     <w:r>
       <w:fldChar w:fldCharType="end"/>
@@ -568,7 +568,7 @@
       <w:fldChar w:fldCharType="separate"/>
     </w:r>
     <w:r>
-      <w:t>3</w:t>
+      <w:t>1</w:t>
     </w:r>
     <w:r>
       <w:fldChar w:fldCharType="end"/>
@@ -595,16 +595,16 @@
   <w:p>
     <w:pPr>
       <w:pStyle w:val="Header"/>
+      <w:pBdr>
+        <w:top w:val="nil"/>
+        <w:left w:val="nil"/>
+        <w:bottom w:val="single" w:sz="4" w:space="8" w:color="D8DEE5"/>
+        <w:right w:val="nil"/>
+        <w:between w:val="nil"/>
+      </w:pBdr>
       <w:tabs>
         <w:tab w:pos="9298" w:val="right"/>
       </w:tabs>
-      <w:pBdr>
-        <w:top w:val="nil"/>
-        <w:left w:val="nil"/>
-        <w:right w:val="nil"/>
-        <w:between w:val="nil"/>
-        <w:bottom w:val="single" w:sz="4" w:space="8" w:color="D8DEE5"/>
-      </w:pBdr>
     </w:pPr>
     <w:r>
       <w:drawing>
@@ -12756,7 +12756,7 @@
     <w:next w:val="Normal"/>
     <w:pPr>
       <w:keepLines/>
-      <w:shd w:fill="CAF0F8"/>
+      <w:shd w:val="clear" w:fill="CAF0F8"/>
       <w:spacing w:before="240" w:after="320"/>
     </w:pPr>
     <w:rPr>
@@ -12785,7 +12785,7 @@
     <w:next w:val="Normal"/>
     <w:pPr>
       <w:keepLines/>
-      <w:shd w:fill="F2F2F2"/>
+      <w:shd w:val="clear" w:fill="F2F2F2"/>
     </w:pPr>
     <w:rPr>
       <w:rFonts w:ascii="Geist Mono" w:hAnsi="Geist Mono" w:eastAsia="Geist Mono" w:cs="Geist Mono"/>
@@ -12823,12 +12823,6 @@
       <w:sz w:val="20"/>
     </w:rPr>
     <w:tblPr>
-      <w:tblCellMar>
-        <w:top w:w="120" w:type="dxa"/>
-        <w:left w:w="120" w:type="dxa"/>
-        <w:bottom w:w="120" w:type="dxa"/>
-        <w:right w:w="120" w:type="dxa"/>
-      </w:tblCellMar>
       <w:tblBorders>
         <w:top w:val="single" w:sz="4" w:color="D8DEE5"/>
         <w:left w:val="single" w:sz="4" w:color="D8DEE5"/>
@@ -12837,6 +12831,12 @@
         <w:insideH w:val="single" w:sz="4" w:color="D8DEE5"/>
         <w:insideV w:val="single" w:sz="4" w:color="D8DEE5"/>
       </w:tblBorders>
+      <w:tblCellMar>
+        <w:top w:w="120" w:type="dxa"/>
+        <w:left w:w="120" w:type="dxa"/>
+        <w:bottom w:w="120" w:type="dxa"/>
+        <w:right w:w="120" w:type="dxa"/>
+      </w:tblCellMar>
     </w:tblPr>
     <w:tblStylePr w:type="firstRow">
       <w:rPr>
@@ -12844,7 +12844,7 @@
         <w:color w:val="FFFFFF"/>
       </w:rPr>
       <w:tcPr>
-        <w:shd w:fill="03045E"/>
+        <w:shd w:val="clear" w:fill="03045E"/>
       </w:tcPr>
     </w:tblStylePr>
   </w:style>

</xml_diff>

<commit_message>
fix(word-template): remove field-update prompt and fix OOXML schema order (#5)
- Remove w:updateFields so Word no longer asks to update fields on open.
- Set the cached PAGE / NUMPAGES results to 1 instead of the sample's 2 / 3.
- Put w:pBdr and w:shd in ECMA-376 schema order inside w:pPr, and write
  pBdr children as top, left, bottom, right, between.
- Put tblBorders before tblCellMar in the AD table style; give every w:shd
  w:val="clear".
- Add w:percent to w:zoom and move w:embedTrueTypeFonts to its schema position.

Both templates now pass XSD validation.
</commit_message>
<xml_diff>
--- a/templates/Accelerate-Data-Document-Template.docx
+++ b/templates/Accelerate-Data-Document-Template.docx
@@ -60,14 +60,14 @@
     <w:p>
       <w:pPr>
         <w:pStyle w:val="Subtitle"/>
+        <w:pBdr>
+          <w:top w:val="nil"/>
+          <w:left w:val="nil"/>
+          <w:bottom w:val="single" w:sz="12" w:space="16" w:color="00B4D8"/>
+          <w:right w:val="nil"/>
+          <w:between w:val="nil"/>
+        </w:pBdr>
         <w:spacing w:after="600"/>
-        <w:pBdr>
-          <w:top w:val="nil"/>
-          <w:left w:val="nil"/>
-          <w:right w:val="nil"/>
-          <w:between w:val="nil"/>
-          <w:bottom w:val="single" w:sz="12" w:space="16" w:color="00B4D8"/>
-        </w:pBdr>
       </w:pPr>
       <w:r>
         <w:t>[A short subtitle that states the purpose and intended outcome.]</w:t>
@@ -152,10 +152,10 @@
         <w:pStyle w:val="ADcallout"/>
         <w:pBdr>
           <w:top w:val="nil"/>
+          <w:left w:val="single" w:sz="16" w:space="10" w:color="00B4D8"/>
           <w:bottom w:val="nil"/>
           <w:right w:val="nil"/>
           <w:between w:val="nil"/>
-          <w:left w:val="single" w:sz="16" w:space="10" w:color="00B4D8"/>
         </w:pBdr>
       </w:pPr>
       <w:r>
@@ -531,16 +531,16 @@
   <w:p>
     <w:pPr>
       <w:pStyle w:val="Footer"/>
-      <w:tabs>
-        <w:tab w:pos="9298" w:val="right"/>
-      </w:tabs>
       <w:pBdr>
+        <w:top w:val="single" w:sz="4" w:space="8" w:color="D8DEE5"/>
         <w:left w:val="nil"/>
         <w:bottom w:val="nil"/>
         <w:right w:val="nil"/>
         <w:between w:val="nil"/>
-        <w:top w:val="single" w:sz="4" w:space="8" w:color="D8DEE5"/>
       </w:pBdr>
+      <w:tabs>
+        <w:tab w:pos="9298" w:val="right"/>
+      </w:tabs>
     </w:pPr>
     <w:r>
       <w:t>Accelerate Data  ·  [Classification]</w:t>
@@ -554,7 +554,7 @@
       <w:fldChar w:fldCharType="separate"/>
     </w:r>
     <w:r>
-      <w:t>2</w:t>
+      <w:t>1</w:t>
     </w:r>
     <w:r>
       <w:fldChar w:fldCharType="end"/>
@@ -568,7 +568,7 @@
       <w:fldChar w:fldCharType="separate"/>
     </w:r>
     <w:r>
-      <w:t>3</w:t>
+      <w:t>1</w:t>
     </w:r>
     <w:r>
       <w:fldChar w:fldCharType="end"/>
@@ -595,16 +595,16 @@
   <w:p>
     <w:pPr>
       <w:pStyle w:val="Header"/>
+      <w:pBdr>
+        <w:top w:val="nil"/>
+        <w:left w:val="nil"/>
+        <w:bottom w:val="single" w:sz="4" w:space="8" w:color="D8DEE5"/>
+        <w:right w:val="nil"/>
+        <w:between w:val="nil"/>
+      </w:pBdr>
       <w:tabs>
         <w:tab w:pos="9298" w:val="right"/>
       </w:tabs>
-      <w:pBdr>
-        <w:top w:val="nil"/>
-        <w:left w:val="nil"/>
-        <w:right w:val="nil"/>
-        <w:between w:val="nil"/>
-        <w:bottom w:val="single" w:sz="4" w:space="8" w:color="D8DEE5"/>
-      </w:pBdr>
     </w:pPr>
     <w:r>
       <w:drawing>
@@ -12756,7 +12756,7 @@
     <w:next w:val="Normal"/>
     <w:pPr>
       <w:keepLines/>
-      <w:shd w:fill="CAF0F8"/>
+      <w:shd w:val="clear" w:fill="CAF0F8"/>
       <w:spacing w:before="240" w:after="320"/>
     </w:pPr>
     <w:rPr>
@@ -12785,7 +12785,7 @@
     <w:next w:val="Normal"/>
     <w:pPr>
       <w:keepLines/>
-      <w:shd w:fill="F2F2F2"/>
+      <w:shd w:val="clear" w:fill="F2F2F2"/>
     </w:pPr>
     <w:rPr>
       <w:rFonts w:ascii="Geist Mono" w:hAnsi="Geist Mono" w:eastAsia="Geist Mono" w:cs="Geist Mono"/>
@@ -12823,12 +12823,6 @@
       <w:sz w:val="20"/>
     </w:rPr>
     <w:tblPr>
-      <w:tblCellMar>
-        <w:top w:w="120" w:type="dxa"/>
-        <w:left w:w="120" w:type="dxa"/>
-        <w:bottom w:w="120" w:type="dxa"/>
-        <w:right w:w="120" w:type="dxa"/>
-      </w:tblCellMar>
       <w:tblBorders>
         <w:top w:val="single" w:sz="4" w:color="D8DEE5"/>
         <w:left w:val="single" w:sz="4" w:color="D8DEE5"/>
@@ -12837,6 +12831,12 @@
         <w:insideH w:val="single" w:sz="4" w:color="D8DEE5"/>
         <w:insideV w:val="single" w:sz="4" w:color="D8DEE5"/>
       </w:tblBorders>
+      <w:tblCellMar>
+        <w:top w:w="120" w:type="dxa"/>
+        <w:left w:w="120" w:type="dxa"/>
+        <w:bottom w:w="120" w:type="dxa"/>
+        <w:right w:w="120" w:type="dxa"/>
+      </w:tblCellMar>
     </w:tblPr>
     <w:tblStylePr w:type="firstRow">
       <w:rPr>
@@ -12844,7 +12844,7 @@
         <w:color w:val="FFFFFF"/>
       </w:rPr>
       <w:tcPr>
-        <w:shd w:fill="03045E"/>
+        <w:shd w:val="clear" w:fill="03045E"/>
       </w:tcPr>
     </w:tblStylePr>
   </w:style>

</xml_diff>